<commit_message>
Align Figure 6 caption with the release-time limitation
The caption described the thumb as clearing 'before the fingers'. The finger
markers in panel (b) sit at the pitch-window boundary rather than at an
independently detected crossing, so the interval is now described as the
thumb's lead on the end of ball contact.

Also corrects the effort-only R-squared to 0.743 in the README, matching the
refit value, and refreshes the bundled archive.
</commit_message>
<xml_diff>
--- a/thesis/MSCS_Paper.docx
+++ b/thesis/MSCS_Paper.docx
@@ -9276,7 +9276,7 @@
           <wp:inline>
             <wp:extent cx="5943600" cy="3030433"/>
             <wp:effectExtent b="0" l="0" r="0" t="0"/>
-            <wp:docPr descr="Two-panel grip-force trace for one fastball. The left panel shows index, middle, and thumb force in newtons over the full pitch with each digit’s peak marked; the right panel expands the final milliseconds, showing the thumb losing contact before the fingers." title="" id="81" name="Picture"/>
+            <wp:docPr descr="Two-panel grip-force trace for one fastball. The left panel shows index, middle, and thumb force in newtons over the full pitch with each digit’s peak marked; the right panel expands the final milliseconds, showing the thumb unloading before the end of ball contact." title="" id="81" name="Picture"/>
             <a:graphic>
               <a:graphicData uri="http://schemas.openxmlformats.org/drawingml/2006/picture">
                 <pic:pic>
@@ -9319,7 +9319,7 @@
         <w:pStyle w:val="ImageCaption"/>
       </w:pPr>
       <w:r>
-        <w:t xml:space="preserve">Two-panel grip-force trace for one fastball. The left panel shows index, middle, and thumb force in newtons over the full pitch with each digit’s peak marked; the right panel expands the final milliseconds, showing the thumb losing contact before the fingers.</w:t>
+        <w:t xml:space="preserve">Two-panel grip-force trace for one fastball. The left panel shows index, middle, and thumb force in newtons over the full pitch with each digit’s peak marked; the right panel expands the final milliseconds, showing the thumb unloading before the end of ball contact.</w:t>
       </w:r>
     </w:p>
     <w:p>
@@ -9343,7 +9343,7 @@
         <w:t xml:space="preserve"> </w:t>
       </w:r>
       <w:r>
-        <w:t xml:space="preserve">Panel (a): the full pitch, all three instrumented digits, force in newtons against time, sampled at 480 Hz. Filled markers indicate each digit’s peak. Panel (b): the final 60 ms expanded, with hollow markers at each digit’s release point—the last sample above 10 percent of that digit’s peak—and a dashed rule at each. The reader should observe three things: the three digits load together over roughly 200 ms and peak within a few milliseconds of one another; the middle finger carries far less force than the index and thumb on this grip; and the digits do not release simultaneously, the thumb clearing 16 ms before the fingers on this pitch. It is the second panel that the 480 Hz sampling rate exists to produce; at 120 Hz the entire expanded window spans about seven samples.</w:t>
+        <w:t xml:space="preserve">Panel (a): the full pitch, all three instrumented digits, force in newtons against time, sampled at 480 Hz. Filled markers indicate each digit’s peak. Panel (b): the final 60 ms expanded, with hollow markers at each digit’s release point—the last sample above 10 percent of that digit’s peak—and a dashed rule at each. The reader should observe three things: the three digits load together over roughly 200 ms and peak within a few milliseconds of one another; the middle finger carries far less force than the index and thumb on this grip; and the thumb unloads first, clearing its threshold 16 ms before the finger channels reach the end of the pitch window on this pitch—an interval that should be read as the thumb’s lead on the end of ball contact rather than as an ordering of two independently resolved release events, for the reason given in the limitations. It is the second panel that the 480 Hz sampling rate exists to produce; at 120 Hz the entire expanded window spans about seven samples.</w:t>
       </w:r>
     </w:p>
     <w:p>

</xml_diff>